<commit_message>
Rebrand User Manual and Technical Reference title pages
Updated both docs' cover pages and file metadata to the correct product
name ("Anknovate Inventory & POS System" by Anknovate IT Services) and
noted that this reference deployment runs SunZan, a mobile phone
accessories retailer - matching the branding distinction just applied
across the live app (product vs. merchant). Re-rendered and visually
verified both cover pages; page counts unchanged (13 and 17 pages).

Co-Authored-By: Claude Sonnet 5 <noreply@anthropic.com>
Claude-Session: https://claude.ai/code/session_0152pDWamwnXcTyMUzj6ySrV
</commit_message>
<xml_diff>
--- a/docs/IMS-POS-Technical-Reference.docx
+++ b/docs/IMS-POS-Technical-Reference.docx
@@ -15,7 +15,7 @@
           <w:sz w:val="56"/>
           <w:szCs w:val="56"/>
         </w:rPr>
-        <w:t xml:space="preserve">Inventory Management &amp; Point-of-Sale System</w:t>
+        <w:t xml:space="preserve">Anknovate Inventory &amp; POS System</w:t>
       </w:r>
     </w:p>
     <w:p>
@@ -55,6 +55,21 @@
           <w:szCs w:val="22"/>
         </w:rPr>
         <w:t xml:space="preserve">Architecture, database schema, API reference and business rules, for developers maintaining or extending the codebase.</w:t>
+      </w:r>
+    </w:p>
+    <w:p>
+      <w:pPr>
+        <w:spacing w:after="160"/>
+      </w:pPr>
+      <w:r>
+        <w:rPr>
+          <w:i/>
+          <w:iCs/>
+          <w:color w:val="888888"/>
+          <w:sz w:val="18"/>
+          <w:szCs w:val="18"/>
+        </w:rPr>
+        <w:t xml:space="preserve">Product: Anknovate Inventory &amp; POS System, by Anknovate IT Services (anknovate.com). This reference deployment runs SunZan, a mobile phone accessories retailer.</w:t>
       </w:r>
     </w:p>
     <w:p>

</xml_diff>